<commit_message>
easy ocr to paddle ocr and String to Base64_String and remove id
</commit_message>
<xml_diff>
--- a/temp/id-pres1.docx
+++ b/temp/id-pres1.docx
@@ -4,107 +4,147 @@
   <w:body>
     <w:p>
       <w:r>
-        <w:t>simply</w:t>
+        <w:t>PRESCRIPTION TEMPLATE</w:t>
       </w:r>
     </w:p>
     <w:p>
       <w:r>
-        <w:t>healthcare</w:t>
+        <w:t>Prescription No. Prescription Date</w:t>
       </w:r>
     </w:p>
     <w:p>
       <w:r>
-        <w:t>Important Provider Notification</w:t>
+        <w:t>0001 November 8, 2021</w:t>
       </w:r>
     </w:p>
     <w:p>
       <w:r>
-        <w:t>Informed Consent for Psychotherapeutic Medication Update</w:t>
+        <w:t>Patient Information</w:t>
       </w:r>
     </w:p>
     <w:p>
       <w:r>
-        <w:t>Pur;uiinl Ic stalule: 409.912051) prescroudica C7id trc i 5oKcjid Orogrm Withoul Jnc: Aaty Mtly' rio( DJily Ic # (sycncron : {ticdictinen croress jno ikorco consunt arirc</w:t>
+        <w:t>Name Age</w:t>
       </w:r>
     </w:p>
     <w:p>
       <w:r>
-        <w:t>rwedical recotd and @tovide (he pharmiacy With parent Cr leg31 guaroian. The physiclan shall document the consent In the chlld $ SJaned attesta[lon ol thjs documentation</w:t>
+        <w:t>Anne Burton 30</w:t>
       </w:r>
     </w:p>
     <w:p>
       <w:r>
-        <w:t>with thc prcrcriolion</w:t>
+        <w:t>Phone Number Date of Birth</w:t>
       </w:r>
     </w:p>
     <w:p>
       <w:r>
-        <w:t>Florida Statute 394.492031 "'Child" Mganz Corgonton burth untk [he Derson 130h Dinoby_</w:t>
+        <w:t>(123) 123-4567 Wednesday, November 8, 1989</w:t>
       </w:r>
     </w:p>
     <w:p>
       <w:r>
-        <w:t>Paychotropic anxich' mcoicatonc (Ptycnoinerapeutic anjMocd %abllizcr lucdicutions nicIuje ;nbx;ycholic; Anticonvulsants and ADHD medicalions (simulants unlicefcu;ni:;</w:t>
+        <w:t>Email Gender</w:t>
       </w:r>
     </w:p>
     <w:p>
       <w:r>
-        <w:t>ano non-S-imulants gubiec_ the Inicrmed congent afe Ilsled below_ rolncluded at tnIS tIMa Tne Qenencrames 0l Ihoze Madicatione</w:t>
+        <w:t>anne.burton@noemailtest.com Female</w:t>
       </w:r>
     </w:p>
     <w:p>
       <w:r>
-        <w:t>Aruzolune aminnelne CDuCMICAnene Dmienin #uprlilie Menrhim Kunerdun- Aelinfrmhici</w:t>
+        <w:t>Address</w:t>
       </w:r>
     </w:p>
     <w:p>
       <w:r>
-        <w:t>Amobamni Amoxapi Dron riol Dukacnc MnaznpMe Aanu Slculine 4nuliuc</w:t>
+        <w:t>1372 Payne Street</w:t>
       </w:r>
     </w:p>
     <w:p>
       <w:r>
-        <w:t>Anrnzole Amlodufiil EicilulpTum Euzaln MulueJt Nelacana 5liuM Oxtl Temizerne</w:t>
+        <w:t>Richlands, VA, 24641</w:t>
       </w:r>
     </w:p>
     <w:p>
       <w:r>
-        <w:t>Asenmnin EumaTAA Foniclcn FM-I Nonrini;lin Olanzanine Thictinzin Hhnc</w:t>
+        <w:t>Allergies Notable Health Condition</w:t>
       </w:r>
     </w:p>
     <w:p>
       <w:r>
-        <w:t>Rusi : isueafmoit UFuac FlpIcinne CCCAM FIp-TILUMG Hl nrunn Ufnu</w:t>
+        <w:t>Seafood None</w:t>
       </w:r>
     </w:p>
     <w:p>
       <w:r>
-        <w:t>(hindiuzepaxulc Choromnzin: Flrzerm FutnxaMnc Khmoteun Kemher-zinc Unazomm Unhuonemizine</w:t>
+        <w:t>List of Prescribed Medications</w:t>
       </w:r>
     </w:p>
     <w:p>
       <w:r>
-        <w:t>Calomul Clumnipnmle Halencudcl Ilp-rilulle KcucLI Mnufide Tumiparntne Venlal:XMIC</w:t>
+        <w:t>Medication Name Purpose Dosage Route Frequency</w:t>
       </w:r>
     </w:p>
     <w:p>
       <w:r>
-        <w:t>Clomaenille Clozmin Imnrimin Iancurtaxi Frolnntyline Quzerm Vlazodun_ Znlenlon</w:t>
+        <w:t>Expectorant Removes 1 tablet Oral Every 4 hours</w:t>
       </w:r>
     </w:p>
     <w:p>
       <w:r>
-        <w:t>LnrSinaam Uencnimms CLNeMAAAT IMI - Luc-{matiuc Kc;MCc VmcME Hlaut* VnniTI</w:t>
+        <w:t>phlegm</w:t>
       </w:r>
     </w:p>
     <w:p>
       <w:r>
-        <w:t>IMGiSnA</w:t>
+        <w:t>Paracetamol For fever 1 tablet Oral Every 4 hours</w:t>
       </w:r>
     </w:p>
     <w:p>
       <w:r>
-        <w:t>Effcctvc Septe mbcr Mebeuras AhCA has put in piace; Simply Healihcarc Pians shall fo &amp;w this proccdurc support of</w:t>
+        <w:t>Anti-biotic Bacterial 500mg Oral Every 8 hours</w:t>
+      </w:r>
+    </w:p>
+    <w:p>
+      <w:r>
+        <w:t>infection</w:t>
+      </w:r>
+    </w:p>
+    <w:p>
+      <w:r>
+        <w:t>Vitamin C Immune system 500mg Oral Once a day</w:t>
+      </w:r>
+    </w:p>
+    <w:p>
+      <w:r>
+        <w:t>Vitamin D Immune System 1 tablet Oral Once a day</w:t>
+      </w:r>
+    </w:p>
+    <w:p>
+      <w:r>
+        <w:t>Physician Name Physician Phone Number</w:t>
+      </w:r>
+    </w:p>
+    <w:p>
+      <w:r>
+        <w:t>Leslie Holden (112) 312-3456</w:t>
+      </w:r>
+    </w:p>
+    <w:p>
+      <w:r>
+        <w:t>Physician Signature Physician Email</w:t>
+      </w:r>
+    </w:p>
+    <w:p>
+      <w:r>
+        <w:t>leslie.h@noemail.com</w:t>
+      </w:r>
+    </w:p>
+    <w:p>
+      <w:r>
+        <w:t>November 9, 2021</w:t>
       </w:r>
     </w:p>
     <w:sectPr>

</xml_diff>